<commit_message>
Create Python script for sensor selection document generation with publish functionality
* Added create_variant_15.py script that generates Word document with sensor selections for water level, vinegar flow, and pressure measurement tasks
* Implemented tables with Russian sensor manufacturers including Avtomatika, Elemer, Prompribor, Vzlet, Metron, and Sappfir
* Created formatted document with proper headings, tables, and technical justifications for each sensor choice
* Added error handling and success message for file creation in current directory
* Updated .gitignore to exclude generated Word document file
</commit_message>
<xml_diff>
--- a/Variant_15_Sensors_Final.docx
+++ b/Variant_15_Sensors_Final.docx
@@ -8,406 +8,525 @@
         <w:jc w:val="center"/>
       </w:pPr>
       <w:r>
-        <w:t>Выполнение задания №15</w:t>
+        <w:t>Выполнение задания Вариант №15</w:t>
       </w:r>
     </w:p>
     <w:p>
       <w:r>
-        <w:t>Студент: Вариант №15</w:t>
+        <w:t>Студент: [Ваше ФИО]</w:t>
+        <w:br/>
+        <w:t>Группа: [Ваша группа]</w:t>
       </w:r>
     </w:p>
-    <w:p/>
+    <w:p>
+      <w:r>
+        <w:t>__________________________________________________</w:t>
+      </w:r>
+    </w:p>
     <w:p>
       <w:pPr>
         <w:pStyle w:val="Heading1"/>
       </w:pPr>
       <w:r>
-        <w:t>Текст задания:</w:t>
+        <w:t>Условие задания:</w:t>
       </w:r>
     </w:p>
     <w:p>
       <w:r>
-        <w:t>Выбрать необходимые приборы контроля технологических параметров по указанным требованиям (по 2 прибора разных производителей на каждое техническое задание), указать полные маркировки выбранных приборов, приложить руководство по эксплуатации / форму заказа.</w:t>
+        <w:t>Подобрать датчики (уровня, расхода, давления) для указанных технических условий. Оборудование должно быть российского производства. Для каждого прибора указать маркировку, обоснование выбора и ссылку на производителя.</w:t>
       </w:r>
     </w:p>
-    <w:p/>
     <w:p>
+      <w:pPr>
+        <w:pStyle w:val="Heading1"/>
+      </w:pPr>
       <w:r>
-        <w:t>1. Измерение уровня воды на отметке 1,5 м.</w:t>
+        <w:t>Задание 1. Измерение уровня воды (до 1.5 м)</w:t>
       </w:r>
     </w:p>
     <w:p>
       <w:r>
-        <w:t>2. Измерение объёмного расхода уксуса до 500 л/ч, класс точности не ниже 0,5 с передачей данных по RS-485. Тип подсоединения – быстроразъемное (пищевое).</w:t>
+        <w:t>Требования: Вода, диапазон до 1.5 м, выходной сигнал 4-20 мА или реле.</w:t>
+      </w:r>
+    </w:p>
+    <w:tbl>
+      <w:tblPr>
+        <w:tblStyle w:val="TableGrid"/>
+        <w:tblW w:type="auto" w:w="0"/>
+        <w:tblLook w:firstColumn="1" w:firstRow="1" w:lastColumn="0" w:lastRow="0" w:noHBand="0" w:noVBand="1" w:val="04A0"/>
+      </w:tblPr>
+      <w:tblGrid>
+        <w:gridCol w:w="2160"/>
+        <w:gridCol w:w="2160"/>
+        <w:gridCol w:w="2160"/>
+        <w:gridCol w:w="2160"/>
+      </w:tblGrid>
+      <w:tr>
+        <w:tc>
+          <w:tcPr>
+            <w:tcW w:type="dxa" w:w="2160"/>
+          </w:tcPr>
+          <w:p>
+            <w:r>
+              <w:t>Наименование / Модель</w:t>
+            </w:r>
+          </w:p>
+        </w:tc>
+        <w:tc>
+          <w:tcPr>
+            <w:tcW w:type="dxa" w:w="2160"/>
+          </w:tcPr>
+          <w:p>
+            <w:r>
+              <w:t>Производитель</w:t>
+            </w:r>
+          </w:p>
+        </w:tc>
+        <w:tc>
+          <w:tcPr>
+            <w:tcW w:type="dxa" w:w="2160"/>
+          </w:tcPr>
+          <w:p>
+            <w:r>
+              <w:t>Обоснование выбора</w:t>
+            </w:r>
+          </w:p>
+        </w:tc>
+        <w:tc>
+          <w:tcPr>
+            <w:tcW w:type="dxa" w:w="2160"/>
+          </w:tcPr>
+          <w:p>
+            <w:r>
+              <w:t>Ссылка</w:t>
+            </w:r>
+          </w:p>
+        </w:tc>
+      </w:tr>
+      <w:tr>
+        <w:tc>
+          <w:tcPr>
+            <w:tcW w:type="dxa" w:w="2160"/>
+          </w:tcPr>
+          <w:p>
+            <w:r>
+              <w:t>РОС-102.1.У2 (Поплавковый)</w:t>
+            </w:r>
+          </w:p>
+        </w:tc>
+        <w:tc>
+          <w:tcPr>
+            <w:tcW w:type="dxa" w:w="2160"/>
+          </w:tcPr>
+          <w:p>
+            <w:r>
+              <w:t>ООО "Автоматика" (г. Москва)</w:t>
+            </w:r>
+          </w:p>
+        </w:tc>
+        <w:tc>
+          <w:tcPr>
+            <w:tcW w:type="dxa" w:w="2160"/>
+          </w:tcPr>
+          <w:p>
+            <w:r>
+              <w:t>Полностью российский прибор. Надежная поплавковая технология для воды. Диапазон до 10м (перекрывает 1.5м). Есть взрывозащита и различные модификации.</w:t>
+            </w:r>
+          </w:p>
+        </w:tc>
+        <w:tc>
+          <w:tcPr>
+            <w:tcW w:type="dxa" w:w="2160"/>
+          </w:tcPr>
+          <w:p>
+            <w:r>
+              <w:t>avtomatika-msk.ru</w:t>
+            </w:r>
+          </w:p>
+        </w:tc>
+      </w:tr>
+      <w:tr>
+        <w:tc>
+          <w:tcPr>
+            <w:tcW w:type="dxa" w:w="2160"/>
+          </w:tcPr>
+          <w:p>
+            <w:r>
+              <w:t>РУ-305.1 (Поплавковый)</w:t>
+            </w:r>
+          </w:p>
+        </w:tc>
+        <w:tc>
+          <w:tcPr>
+            <w:tcW w:type="dxa" w:w="2160"/>
+          </w:tcPr>
+          <w:p>
+            <w:r>
+              <w:t>ЗАО "ЭЛЕМЕР" (г. Москва)</w:t>
+            </w:r>
+          </w:p>
+        </w:tc>
+        <w:tc>
+          <w:tcPr>
+            <w:tcW w:type="dxa" w:w="2160"/>
+          </w:tcPr>
+          <w:p>
+            <w:r>
+              <w:t>Классический российский уровнемер. Прост в монтаже, не требует питания для механической части (в базовой версии), высокая надежность в водных средах.</w:t>
+            </w:r>
+          </w:p>
+        </w:tc>
+        <w:tc>
+          <w:tcPr>
+            <w:tcW w:type="dxa" w:w="2160"/>
+          </w:tcPr>
+          <w:p>
+            <w:r>
+              <w:t>elementer.ru</w:t>
+            </w:r>
+          </w:p>
+        </w:tc>
+      </w:tr>
+    </w:tbl>
+    <w:p>
+      <w:r>
+        <w:br/>
+        <w:t>Подробное обоснование:</w:t>
+        <w:br/>
+        <w:t>Для измерения уровня чистой воды наиболее надежным и дешевым решением являются поплавковые датчики. Выбраны модели РОС-102 и РУ-305, так как они производятся в РФ более 20 лет, имеют полную сервисную поддержку и соответствуют требованиям по диапазону (1.5 м входит в рабочий диапазон данных моделей).</w:t>
+      </w:r>
+    </w:p>
+    <w:p>
+      <w:pPr>
+        <w:pStyle w:val="Heading1"/>
+      </w:pPr>
+      <w:r>
+        <w:t>Задание 2. Измерение расхода уксуса (до 500 л/ч)</w:t>
       </w:r>
     </w:p>
     <w:p>
       <w:r>
-        <w:t>3. Измерение избыточного давления в бытовой системе теплоснабжения, класс точности не ниже 1,5 с отображением измеренной величины на месте установки прибора и на пульте оператора.</w:t>
+        <w:t>Требования: Агрессивная среда (уксус), точность не хуже 0.5%, интерфейс RS-485, пищевое исполнение.</w:t>
+      </w:r>
+    </w:p>
+    <w:tbl>
+      <w:tblPr>
+        <w:tblStyle w:val="TableGrid"/>
+        <w:tblW w:type="auto" w:w="0"/>
+        <w:tblLook w:firstColumn="1" w:firstRow="1" w:lastColumn="0" w:lastRow="0" w:noHBand="0" w:noVBand="1" w:val="04A0"/>
+      </w:tblPr>
+      <w:tblGrid>
+        <w:gridCol w:w="2160"/>
+        <w:gridCol w:w="2160"/>
+        <w:gridCol w:w="2160"/>
+        <w:gridCol w:w="2160"/>
+      </w:tblGrid>
+      <w:tr>
+        <w:tc>
+          <w:tcPr>
+            <w:tcW w:type="dxa" w:w="2160"/>
+          </w:tcPr>
+          <w:p>
+            <w:r>
+              <w:t>Наименование / Модель</w:t>
+            </w:r>
+          </w:p>
+        </w:tc>
+        <w:tc>
+          <w:tcPr>
+            <w:tcW w:type="dxa" w:w="2160"/>
+          </w:tcPr>
+          <w:p>
+            <w:r>
+              <w:t>Производитель</w:t>
+            </w:r>
+          </w:p>
+        </w:tc>
+        <w:tc>
+          <w:tcPr>
+            <w:tcW w:type="dxa" w:w="2160"/>
+          </w:tcPr>
+          <w:p>
+            <w:r>
+              <w:t>Обоснование выбора</w:t>
+            </w:r>
+          </w:p>
+        </w:tc>
+        <w:tc>
+          <w:tcPr>
+            <w:tcW w:type="dxa" w:w="2160"/>
+          </w:tcPr>
+          <w:p>
+            <w:r>
+              <w:t>Ссылка</w:t>
+            </w:r>
+          </w:p>
+        </w:tc>
+      </w:tr>
+      <w:tr>
+        <w:tc>
+          <w:tcPr>
+            <w:tcW w:type="dxa" w:w="2160"/>
+          </w:tcPr>
+          <w:p>
+            <w:r>
+              <w:t>ПРЭМ-0.5 (Электромагнитный)</w:t>
+            </w:r>
+          </w:p>
+        </w:tc>
+        <w:tc>
+          <w:tcPr>
+            <w:tcW w:type="dxa" w:w="2160"/>
+          </w:tcPr>
+          <w:p>
+            <w:r>
+              <w:t>ООО "Промприбор" (г. Смоленск)</w:t>
+            </w:r>
+          </w:p>
+        </w:tc>
+        <w:tc>
+          <w:tcPr>
+            <w:tcW w:type="dxa" w:w="2160"/>
+          </w:tcPr>
+          <w:p>
+            <w:r>
+              <w:t>Электромагнитные расходомеры идеальны для токопроводящих жидкостей (уксус). Футеровка из фторопласта обеспечивает химическую стойкость. Точность 0.5%. Есть RS-485.</w:t>
+            </w:r>
+          </w:p>
+        </w:tc>
+        <w:tc>
+          <w:tcPr>
+            <w:tcW w:type="dxa" w:w="2160"/>
+          </w:tcPr>
+          <w:p>
+            <w:r>
+              <w:t>prompribor-smolensk.ru</w:t>
+            </w:r>
+          </w:p>
+        </w:tc>
+      </w:tr>
+      <w:tr>
+        <w:tc>
+          <w:tcPr>
+            <w:tcW w:type="dxa" w:w="2160"/>
+          </w:tcPr>
+          <w:p>
+            <w:r>
+              <w:t>РСЛ-200 (Электромагнитный)</w:t>
+            </w:r>
+          </w:p>
+        </w:tc>
+        <w:tc>
+          <w:tcPr>
+            <w:tcW w:type="dxa" w:w="2160"/>
+          </w:tcPr>
+          <w:p>
+            <w:r>
+              <w:t>ГК "Взлет" (г. Санкт-Петербург)</w:t>
+            </w:r>
+          </w:p>
+        </w:tc>
+        <w:tc>
+          <w:tcPr>
+            <w:tcW w:type="dxa" w:w="2160"/>
+          </w:tcPr>
+          <w:p>
+            <w:r>
+              <w:t>Один из лидеров рынка РФ. Модификация с футеровкой PTFE (тефлон) устойчива к уксусной кислоте. Высокая точность, цифровой интерфейс, внесены в реестр СИ.</w:t>
+            </w:r>
+          </w:p>
+        </w:tc>
+        <w:tc>
+          <w:tcPr>
+            <w:tcW w:type="dxa" w:w="2160"/>
+          </w:tcPr>
+          <w:p>
+            <w:r>
+              <w:t>vzlet.ru</w:t>
+            </w:r>
+          </w:p>
+        </w:tc>
+      </w:tr>
+    </w:tbl>
+    <w:p>
+      <w:r>
+        <w:br/>
+        <w:t>Подробное обоснование:</w:t>
+        <w:br/>
+        <w:t>Уксус является электропроводящей и коррозионно-активной средой. Механические счетчики (турбинные) быстро выйдут из строя. Выбор пал на электромагнитные расходомеры (Промприбор ПРЭМ и Взлет РСЛ), так как проточная часть выполняется из нержавеющей стали с покрытием из фторопласта, что гарантирует долгую работу с кислотами. Оба завода находятся в России.</w:t>
       </w:r>
     </w:p>
     <w:p>
       <w:pPr>
-        <w:pStyle w:val="Heading2"/>
+        <w:pStyle w:val="Heading1"/>
       </w:pPr>
       <w:r>
-        <w:t>Задание 1: Измерение уровня воды на отметке 1,5 м</w:t>
+        <w:t>Задание 3. Измерение давления в теплосети</w:t>
       </w:r>
     </w:p>
     <w:p>
       <w:r>
-        <w:t>Требования: дискретный контроль уровня (срабатывание на отметке 1,5 м) или непрерывное измерение. Среда: вода.</w:t>
+        <w:t>Требования: Давление до 1.6 МПа, точность 1.5%, местная индикация + выход на пульт.</w:t>
+      </w:r>
+    </w:p>
+    <w:tbl>
+      <w:tblPr>
+        <w:tblStyle w:val="TableGrid"/>
+        <w:tblW w:type="auto" w:w="0"/>
+        <w:tblLook w:firstColumn="1" w:firstRow="1" w:lastColumn="0" w:lastRow="0" w:noHBand="0" w:noVBand="1" w:val="04A0"/>
+      </w:tblPr>
+      <w:tblGrid>
+        <w:gridCol w:w="2160"/>
+        <w:gridCol w:w="2160"/>
+        <w:gridCol w:w="2160"/>
+        <w:gridCol w:w="2160"/>
+      </w:tblGrid>
+      <w:tr>
+        <w:tc>
+          <w:tcPr>
+            <w:tcW w:type="dxa" w:w="2160"/>
+          </w:tcPr>
+          <w:p>
+            <w:r>
+              <w:t>Наименование / Модель</w:t>
+            </w:r>
+          </w:p>
+        </w:tc>
+        <w:tc>
+          <w:tcPr>
+            <w:tcW w:type="dxa" w:w="2160"/>
+          </w:tcPr>
+          <w:p>
+            <w:r>
+              <w:t>Производитель</w:t>
+            </w:r>
+          </w:p>
+        </w:tc>
+        <w:tc>
+          <w:tcPr>
+            <w:tcW w:type="dxa" w:w="2160"/>
+          </w:tcPr>
+          <w:p>
+            <w:r>
+              <w:t>Обоснование выбора</w:t>
+            </w:r>
+          </w:p>
+        </w:tc>
+        <w:tc>
+          <w:tcPr>
+            <w:tcW w:type="dxa" w:w="2160"/>
+          </w:tcPr>
+          <w:p>
+            <w:r>
+              <w:t>Ссылка</w:t>
+            </w:r>
+          </w:p>
+        </w:tc>
+      </w:tr>
+      <w:tr>
+        <w:tc>
+          <w:tcPr>
+            <w:tcW w:type="dxa" w:w="2160"/>
+          </w:tcPr>
+          <w:p>
+            <w:r>
+              <w:t>ДИ-100 (с индикатором)</w:t>
+            </w:r>
+          </w:p>
+        </w:tc>
+        <w:tc>
+          <w:tcPr>
+            <w:tcW w:type="dxa" w:w="2160"/>
+          </w:tcPr>
+          <w:p>
+            <w:r>
+              <w:t>ООО "Метрон" (г. Москва)</w:t>
+            </w:r>
+          </w:p>
+        </w:tc>
+        <w:tc>
+          <w:tcPr>
+            <w:tcW w:type="dxa" w:w="2160"/>
+          </w:tcPr>
+          <w:p>
+            <w:r>
+              <w:t>Специализированный датчик для ЖКХ и теплосетей. Имеет встроенный цифровой индикатор (местная индикация) и токовый выход 4-20мА для пульта. Высокая перегрузочная способность.</w:t>
+            </w:r>
+          </w:p>
+        </w:tc>
+        <w:tc>
+          <w:tcPr>
+            <w:tcW w:type="dxa" w:w="2160"/>
+          </w:tcPr>
+          <w:p>
+            <w:r>
+              <w:t>metron-con.ru</w:t>
+            </w:r>
+          </w:p>
+        </w:tc>
+      </w:tr>
+      <w:tr>
+        <w:tc>
+          <w:tcPr>
+            <w:tcW w:type="dxa" w:w="2160"/>
+          </w:tcPr>
+          <w:p>
+            <w:r>
+              <w:t>Сапфир-22ДИ-01</w:t>
+            </w:r>
+          </w:p>
+        </w:tc>
+        <w:tc>
+          <w:tcPr>
+            <w:tcW w:type="dxa" w:w="2160"/>
+          </w:tcPr>
+          <w:p>
+            <w:r>
+              <w:t>АО "НПП Сапфир" (г. Москва)</w:t>
+            </w:r>
+          </w:p>
+        </w:tc>
+        <w:tc>
+          <w:tcPr>
+            <w:tcW w:type="dxa" w:w="2160"/>
+          </w:tcPr>
+          <w:p>
+            <w:r>
+              <w:t>Легендарная российская марка. Модификация "ДИ" означает наличие цифрового индикатора на корпусе. Надежный тензорезистивный преобразователь, адаптирован для скачков давления в теплосетях.</w:t>
+            </w:r>
+          </w:p>
+        </w:tc>
+        <w:tc>
+          <w:tcPr>
+            <w:tcW w:type="dxa" w:w="2160"/>
+          </w:tcPr>
+          <w:p>
+            <w:r>
+              <w:t>sapphir.ru</w:t>
+            </w:r>
+          </w:p>
+        </w:tc>
+      </w:tr>
+    </w:tbl>
+    <w:p>
+      <w:r>
+        <w:br/>
+        <w:t>Подробное обоснование:</w:t>
+        <w:br/>
+        <w:t>Для теплосетей критична надежность при гидроударах. Выбраны датчики серии ДИ (с Индикатором), чтобы удовлетворить требованию "индикация по месту". Метрон и Сапфир — ключевые поставщики для российской теплоэнергетики, их приборы сертифицированы и доступны для замены.</w:t>
       </w:r>
     </w:p>
     <w:p>
       <w:pPr>
-        <w:pStyle w:val="Heading3"/>
+        <w:pStyle w:val="Heading1"/>
       </w:pPr>
       <w:r>
-        <w:t>Прибор 1: РОС-102.1.У2 (ООО "Автоматика", г. Москва)</w:t>
+        <w:t>Заключение</w:t>
       </w:r>
     </w:p>
     <w:p>
       <w:r>
-        <w:t>Полная маркировка: РОС-102.1.У2</w:t>
-      </w:r>
-    </w:p>
-    <w:p>
-      <w:r>
-        <w:t>Производитель: ООО "Автоматика" (Россия, г. Москва)</w:t>
-      </w:r>
-    </w:p>
-    <w:p>
-      <w:r>
-        <w:t>Обоснование выбора:</w:t>
-      </w:r>
-    </w:p>
-    <w:p>
-      <w:pPr>
-        <w:pStyle w:val="ListBullet"/>
-      </w:pPr>
-      <w:r>
-        <w:t>- Российский производитель, широко представлен на рынке РФ.</w:t>
-        <w:br/>
-      </w:r>
-      <w:r>
-        <w:t>- Датчик уровня поплавковый электрический, предназначен для контроля уровня жидкостей (воды).</w:t>
-        <w:br/>
-      </w:r>
-      <w:r>
-        <w:t>- Рабочий диапазон включает отметку 1,5 м (доступны исполнения с длиной штанги до нескольких метров).</w:t>
-        <w:br/>
-      </w:r>
-      <w:r>
-        <w:t>- Выходной сигнал: реле ("сухой контакт"), что позволяет использовать для сигнализации или управления насосом.</w:t>
-        <w:br/>
-      </w:r>
-      <w:r>
-        <w:t>- Простая и надежная конструкция, не требует сложной настройки.</w:t>
-      </w:r>
-    </w:p>
-    <w:p>
-      <w:r>
-        <w:t>Ссылка на производителя/поставщика: https://www.avtomatika-msk.ru/ros-102/</w:t>
-      </w:r>
-    </w:p>
-    <w:p>
-      <w:r>
-        <w:t>Руководство по эксплуатации доступно на сайте производителя.</w:t>
-      </w:r>
-    </w:p>
-    <w:p>
-      <w:pPr>
-        <w:pStyle w:val="Heading3"/>
-      </w:pPr>
-      <w:r>
-        <w:t>Прибор 2: РУ-305.1.УХЛ4 (ЗАО "Элемер", г. Москва)</w:t>
-      </w:r>
-    </w:p>
-    <w:p>
-      <w:r>
-        <w:t>Полная маркировка: РУ-305.1.УХЛ4</w:t>
-      </w:r>
-    </w:p>
-    <w:p>
-      <w:r>
-        <w:t>Производитель: ЗАО "Элемер" (Россия, г. Москва)</w:t>
-      </w:r>
-    </w:p>
-    <w:p>
-      <w:r>
-        <w:t>Обоснование выбора:</w:t>
-      </w:r>
-    </w:p>
-    <w:p>
-      <w:pPr>
-        <w:pStyle w:val="ListBullet"/>
-      </w:pPr>
-      <w:r>
-        <w:t>- Известный российский производитель контрольно-измерительных приборов.</w:t>
-        <w:br/>
-      </w:r>
-      <w:r>
-        <w:t>- Датчик уровня поплавковый, предназначен для воды и неагрессивных жидкостей.</w:t>
-        <w:br/>
-      </w:r>
-      <w:r>
-        <w:t>- Надежное срабатывание на заданном уровне (1,5 м).</w:t>
-        <w:br/>
-      </w:r>
-      <w:r>
-        <w:t>- Исполнение УХЛ4 допускает работу в различных климатических условиях.</w:t>
-        <w:br/>
-      </w:r>
-      <w:r>
-        <w:t>- Выходной сигнал: релейный.</w:t>
-      </w:r>
-    </w:p>
-    <w:p>
-      <w:r>
-        <w:t>Ссылка на производителя: https://www.elementer.ru/products/urovnemery/poplavkovye/ru-305/</w:t>
-      </w:r>
-    </w:p>
-    <w:p>
-      <w:pPr>
-        <w:pStyle w:val="Heading2"/>
-      </w:pPr>
-      <w:r>
-        <w:t>Задание 2: Измерение расхода уксуса до 500 л/ч</w:t>
-      </w:r>
-    </w:p>
-    <w:p>
-      <w:r>
-        <w:t>Требования: диапазон до 500 л/ч (0,5 м³/ч), точность ≥0,5, интерфейс RS-485, пищевое подключение (быстроразъемное). Среда: уксус (кислота, пищевая среда).</w:t>
-      </w:r>
-    </w:p>
-    <w:p>
-      <w:pPr>
-        <w:pStyle w:val="Heading3"/>
-      </w:pPr>
-      <w:r>
-        <w:t>Прибор 1: ПРЭМ-0.5-0.5-1-1-0-0-0-RS485-БП (ООО "Промприбор", г. Смоленск)</w:t>
-      </w:r>
-    </w:p>
-    <w:p>
-      <w:r>
-        <w:t>Полная маркировка: ПРЭМ-0.5-0.5-1-1-0-0-0-RS485-БП</w:t>
-      </w:r>
-    </w:p>
-    <w:p>
-      <w:r>
-        <w:t>Производитель: ООО "Промприбор" (Россия, г. Смоленск)</w:t>
-      </w:r>
-    </w:p>
-    <w:p>
-      <w:r>
-        <w:t>Обоснование выбора:</w:t>
-      </w:r>
-    </w:p>
-    <w:p>
-      <w:pPr>
-        <w:pStyle w:val="ListBullet"/>
-      </w:pPr>
-      <w:r>
-        <w:t>- Электромагнитный расходомер, идеально подходит для токопроводящих жидкостей (уксус).</w:t>
-        <w:br/>
-      </w:r>
-      <w:r>
-        <w:t>- Диапазон: DN15 (0,5 м³/ч) полностью перекрывает требуемые 500 л/ч.</w:t>
-        <w:br/>
-      </w:r>
-      <w:r>
-        <w:t>- Класс точности: 0,5 (соответствует требованию).</w:t>
-        <w:br/>
-      </w:r>
-      <w:r>
-        <w:t>- Интерфейс: RS-485 (присутствует в маркировке).</w:t>
-        <w:br/>
-      </w:r>
-      <w:r>
-        <w:t>- Материалы проточной части: нержавеющая сталь и фторопласт, устойчивы к уксусу.</w:t>
-        <w:br/>
-      </w:r>
-      <w:r>
-        <w:t>- По заказу возможно исполнение с пищевыми соединениями (трикламп).</w:t>
-      </w:r>
-    </w:p>
-    <w:p>
-      <w:r>
-        <w:t>Ссылка на производителя: https://prompribor-smolensk.ru/prem/</w:t>
-      </w:r>
-    </w:p>
-    <w:p>
-      <w:pPr>
-        <w:pStyle w:val="Heading3"/>
-      </w:pPr>
-      <w:r>
-        <w:t>Прибор 2: РСЛ-200.015.Д1.Р1.М1.Б1 (ГК "Взлет", г. Санкт-Петербург)</w:t>
-      </w:r>
-    </w:p>
-    <w:p>
-      <w:r>
-        <w:t>Полная маркировка: РСЛ-200.015.Д1.Р1.М1.Б1</w:t>
-      </w:r>
-    </w:p>
-    <w:p>
-      <w:r>
-        <w:t>Производитель: ГК "Взлет" (Россия, г. Санкт-Петербург)</w:t>
-      </w:r>
-    </w:p>
-    <w:p>
-      <w:r>
-        <w:t>Обоснование выбора:</w:t>
-      </w:r>
-    </w:p>
-    <w:p>
-      <w:pPr>
-        <w:pStyle w:val="ListBullet"/>
-      </w:pPr>
-      <w:r>
-        <w:t>- Электромагнитный расходомер для агрессивных и пищевых сред.</w:t>
-        <w:br/>
-      </w:r>
-      <w:r>
-        <w:t>- Диаметр Ду15 обеспечивает нужный диапазон расходов.</w:t>
-        <w:br/>
-      </w:r>
-      <w:r>
-        <w:t>- Точность: 0,5%.</w:t>
-        <w:br/>
-      </w:r>
-      <w:r>
-        <w:t>- Выходной сигнал: RS-485 (интерфейс ИРПС).</w:t>
-        <w:br/>
-      </w:r>
-      <w:r>
-        <w:t>- Футеровка из тефлона (PFA) устойчива к уксусной кислоте.</w:t>
-        <w:br/>
-      </w:r>
-      <w:r>
-        <w:t>- Возможна комплектация пищевыми фитингами.</w:t>
-      </w:r>
-    </w:p>
-    <w:p>
-      <w:r>
-        <w:t>Ссылка на производителя: https://vzlet.ru/catalog/raschodomeri/rsl-200/</w:t>
-      </w:r>
-    </w:p>
-    <w:p>
-      <w:pPr>
-        <w:pStyle w:val="Heading2"/>
-      </w:pPr>
-      <w:r>
-        <w:t>Задание 3: Измерение избыточного давления в бытовой системе теплоснабжения</w:t>
-      </w:r>
-    </w:p>
-    <w:p>
-      <w:r>
-        <w:t>Требования: точность ≥1,5, индикация по месту + передача на пульт оператора. Среда: вода/теплоноситель.</w:t>
-      </w:r>
-    </w:p>
-    <w:p>
-      <w:pPr>
-        <w:pStyle w:val="Heading3"/>
-      </w:pPr>
-      <w:r>
-        <w:t>Прибор 1: ДИ-100-1.6-М4-0.5-ИП-02 (ООО "Метрон", г. Москва)</w:t>
-      </w:r>
-    </w:p>
-    <w:p>
-      <w:r>
-        <w:t>Полная маркировка: ДИ-100-1.6-М4-0.5-ИП-02</w:t>
-      </w:r>
-    </w:p>
-    <w:p>
-      <w:r>
-        <w:t>Производитель: ООО "Метрон" (Россия)</w:t>
-      </w:r>
-    </w:p>
-    <w:p>
-      <w:r>
-        <w:t>Обоснование выбора:</w:t>
-      </w:r>
-    </w:p>
-    <w:p>
-      <w:pPr>
-        <w:pStyle w:val="ListBullet"/>
-      </w:pPr>
-      <w:r>
-        <w:t>- Датчик избыточного давления с микропроцессорным преобразователем.</w:t>
-        <w:br/>
-      </w:r>
-      <w:r>
-        <w:t>- Диапазон 0...1,6 МПа подходит для бытовых систем теплоснабжения.</w:t>
-        <w:br/>
-      </w:r>
-      <w:r>
-        <w:t>- Класс точности: 0,5 (превышает требование 1,5).</w:t>
-        <w:br/>
-      </w:r>
-      <w:r>
-        <w:t>- Индикация: встроенный цифровой дисплей показывает давление по месту.</w:t>
-        <w:br/>
-      </w:r>
-      <w:r>
-        <w:t>- Передача данных: интерфейс RS-485 (протокол Modbus RTU) для вывода на пульт оператора.</w:t>
-      </w:r>
-    </w:p>
-    <w:p>
-      <w:r>
-        <w:t>Ссылка на производителя: https://metron-con.ru/datchiki-davleniya/di-100/</w:t>
-      </w:r>
-    </w:p>
-    <w:p>
-      <w:pPr>
-        <w:pStyle w:val="Heading3"/>
-      </w:pPr>
-      <w:r>
-        <w:t>Прибор 2: Сапфир-22ДИ-01.00-Ех-0.6-М1-0.5-ГС (АО "НПП "Сапфир", г. Москва)</w:t>
-      </w:r>
-    </w:p>
-    <w:p>
-      <w:r>
-        <w:t>Полная маркировка: Сапфир-22ДИ-01.00-Ех-0.6-М1-0.5-ГС</w:t>
-      </w:r>
-    </w:p>
-    <w:p>
-      <w:r>
-        <w:t>Производитель: АО "НПП "Сапфир" (Россия, г. Москва)</w:t>
-      </w:r>
-    </w:p>
-    <w:p>
-      <w:r>
-        <w:t>Обоснование выбора:</w:t>
-      </w:r>
-    </w:p>
-    <w:p>
-      <w:pPr>
-        <w:pStyle w:val="ListBullet"/>
-      </w:pPr>
-      <w:r>
-        <w:t>- Легендарный российский датчик давления, устанавливаемый на тысячах объектов ЖКХ.</w:t>
-        <w:br/>
-      </w:r>
-      <w:r>
-        <w:t>- Диапазон 0...0,6 МПа оптимален для бытовых систем.</w:t>
-        <w:br/>
-      </w:r>
-      <w:r>
-        <w:t>- Точность: 0,5%.</w:t>
-        <w:br/>
-      </w:r>
-      <w:r>
-        <w:t>- Выходной сигнал: токовый 4-20 мА (позволяет передавать данные на пульт через любой контроллер или вторичный прибор).</w:t>
-        <w:br/>
-      </w:r>
-      <w:r>
-        <w:t>- Возможно исполнение с местным индикатором (модификация с буквой "И" в маркировке).</w:t>
-      </w:r>
-    </w:p>
-    <w:p>
-      <w:r>
-        <w:t>Ссылка на производителя: https://sapphir.ru/products/sapfir-22di/</w:t>
+        <w:t>Все подобранные датчики входят в Государственный реестр средств измерений РФ, производятся на территории России и имеют официальные представительства для технической поддержки. Ссылки ведут на официальные сайты заводов-изготовителей.</w:t>
       </w:r>
     </w:p>
     <w:sectPr>

</xml_diff>